<commit_message>
Repair canonical catalog and generated downloads
Restores the complete 597-card JSON and replaces every generated download with a compact, verified file after the original large-payload upload was truncated.
</commit_message>
<xml_diff>
--- a/public/downloads/Dojo_Deckbuilder_v2.3_Glossary.docx
+++ b/public/downloads/Dojo_Deckbuilder_v2.3_Glossary.docx
@@ -84,7 +84,7 @@
       <w:r>
         <w:drawing>
           <wp:inline xmlns:a="http://schemas.openxmlformats.org/drawingml/2006/main" xmlns:pic="http://schemas.openxmlformats.org/drawingml/2006/picture">
-            <wp:extent cx="5943600" cy="1983001"/>
+            <wp:extent cx="5943600" cy="1981200"/>
             <wp:docPr id="2" name="Picture 2"/>
             <wp:cNvGraphicFramePr>
               <a:graphicFrameLocks noChangeAspect="1"/>
@@ -105,7 +105,7 @@
                   <pic:spPr>
                     <a:xfrm>
                       <a:off x="0" y="0"/>
-                      <a:ext cx="5943600" cy="1983001"/>
+                      <a:ext cx="5943600" cy="1981200"/>
                     </a:xfrm>
                     <a:prstGeom prst="rect"/>
                   </pic:spPr>

</xml_diff>